<commit_message>
update resume, exact assembly job description.
</commit_message>
<xml_diff>
--- a/public/meta/ben_safigan_resume.docx
+++ b/public/meta/ben_safigan_resume.docx
@@ -12,7 +12,7 @@
           <w:b/>
           <w:sz w:val="26"/>
         </w:rPr>
-        <w:t xml:space="preserve">Benedikt "Ben" </w:t>
+        <w:t xml:space="preserve">Benedikt </w:t>
       </w:r>
       <w:proofErr w:type="spellStart"/>
       <w:r>
@@ -85,10 +85,25 @@
     </w:p>
     <w:p>
       <w:pPr>
-        <w:spacing w:after="120"/>
+        <w:pBdr>
+          <w:bottom w:val="single" w:sz="12" w:space="1" w:color="000000"/>
+        </w:pBdr>
+        <w:spacing w:after="40" w:line="240" w:lineRule="auto"/>
       </w:pPr>
       <w:r>
-        <w:t>CS student at CU Boulder with hands-on, full-stack internship experience, from low-level embedded systems to React/Node.js web applications.</w:t>
+        <w:t>C</w:t>
+      </w:r>
+      <w:r>
+        <w:t xml:space="preserve">omputer </w:t>
+      </w:r>
+      <w:r>
+        <w:t>S</w:t>
+      </w:r>
+      <w:r>
+        <w:t>cience</w:t>
+      </w:r>
+      <w:r>
+        <w:t xml:space="preserve"> student at CU Boulder with hands-on, full-stack internship experience, from low-level embedded systems to React/Node.js web applications.</w:t>
       </w:r>
     </w:p>
     <w:p>
@@ -112,50 +127,19 @@
         </w:tabs>
         <w:spacing w:after="20" w:line="240" w:lineRule="auto"/>
       </w:pPr>
+      <w:proofErr w:type="spellStart"/>
+      <w:proofErr w:type="spellEnd"/>
       <w:r>
         <w:rPr>
           <w:b/>
           <w:sz w:val="20"/>
         </w:rPr>
-        <w:t xml:space="preserve">Software Engineer (Contractor) | </w:t>
+        <w:t>Software Engineer (Contractor) | GovWorx</w:t>
       </w:r>
-      <w:proofErr w:type="spellStart"/>
       <w:r>
-        <w:rPr>
-          <w:b/>
-          <w:sz w:val="20"/>
-        </w:rPr>
-        <w:t>GovWorx</w:t>
-      </w:r>
-      <w:proofErr w:type="spellEnd"/>
-      <w:r>
+        <w:rPr/>
         <w:tab/>
         <w:t>Jun 2026 – Present</w:t>
-      </w:r>
-    </w:p>
-    <w:p>
-      <w:pPr>
-        <w:spacing w:after="20" w:line="240" w:lineRule="auto"/>
-      </w:pPr>
-      <w:r>
-        <w:t xml:space="preserve">Stack: </w:t>
-      </w:r>
-      <w:r>
-        <w:t>.NET, C#, ASP.NET Core, Entity Framework Core, React, TypeScript</w:t>
-      </w:r>
-      <w:r>
-        <w:t>, SQL</w:t>
-      </w:r>
-      <w:r>
-        <w:t xml:space="preserve">, </w:t>
-      </w:r>
-      <w:proofErr w:type="spellStart"/>
-      <w:r>
-        <w:t>OpenTelemetry</w:t>
-      </w:r>
-      <w:proofErr w:type="spellEnd"/>
-      <w:r>
-        <w:t>, Datadog</w:t>
       </w:r>
     </w:p>
     <w:p>
@@ -164,24 +148,16 @@
         <w:spacing w:after="20" w:line="240" w:lineRule="auto"/>
       </w:pPr>
       <w:r>
-        <w:t xml:space="preserve">Contributed to </w:t>
+        <w:t xml:space="preserve">Designed and shipped </w:t>
       </w:r>
-      <w:proofErr w:type="spellStart"/>
       <w:r>
-        <w:t>GovWorxDataAgent</w:t>
+        <w:rPr>
+          <w:b/>
+        </w:rPr>
+        <w:t>three</w:t>
       </w:r>
-      <w:proofErr w:type="spellEnd"/>
       <w:r>
-        <w:t>, an on-premises .NET service that captures real-time 911 emergency-services data (calls, dispatch, and location) and streams it to a cloud AI platform.</w:t>
-      </w:r>
-    </w:p>
-    <w:p>
-      <w:pPr>
-        <w:pStyle w:val="ListBullet"/>
-        <w:spacing w:after="20" w:line="240" w:lineRule="auto"/>
-      </w:pPr>
-      <w:r>
-        <w:t xml:space="preserve">Designed and shipped three CAD (Computer-Aided Dispatch) connectors from scratch: Mark43 REST API connector, IMC connector over Actian Zen ODBC, and </w:t>
+        <w:t xml:space="preserve"> CAD (Computer-Aided Dispatch) connectors from scratch – Mark43 REST API, IMC over Actian Zen ODBC, and </w:t>
       </w:r>
       <w:proofErr w:type="spellStart"/>
       <w:r>
@@ -197,7 +173,15 @@
       </w:r>
       <w:proofErr w:type="spellEnd"/>
       <w:r>
-        <w:t xml:space="preserve"> XML connector. Owned the schema mapping, query logic, and configuration for each.</w:t>
+        <w:t xml:space="preserve"> XML – for </w:t>
+      </w:r>
+      <w:proofErr w:type="spellStart"/>
+      <w:r>
+        <w:t>GovWorxDataAgent</w:t>
+      </w:r>
+      <w:proofErr w:type="spellEnd"/>
+      <w:r>
+        <w:t>, an on-premises .NET service streaming real-time 911 emergency data to a cloud AI platform; owned schema mapping, query logic, and configuration for each.</w:t>
       </w:r>
     </w:p>
     <w:p>
@@ -206,7 +190,7 @@
         <w:spacing w:after="20" w:line="240" w:lineRule="auto"/>
       </w:pPr>
       <w:r>
-        <w:t xml:space="preserve">Extended and hardened existing connectors for public-safety vendors (Tyler, </w:t>
+        <w:t xml:space="preserve">Extended and hardened production connectors for public-safety vendors (Tyler, </w:t>
       </w:r>
       <w:proofErr w:type="spellStart"/>
       <w:r>
@@ -214,16 +198,16 @@
       </w:r>
       <w:proofErr w:type="spellEnd"/>
       <w:r>
-        <w:t>, Hexagon, and Spillman), working across SQL Server, Oracle, Informix, ODBC, REST, and XML data sources.</w:t>
+        <w:t xml:space="preserve">, Hexagon, Spillman) across </w:t>
       </w:r>
-    </w:p>
-    <w:p>
-      <w:pPr>
-        <w:pStyle w:val="ListBullet"/>
-        <w:spacing w:after="20" w:line="240" w:lineRule="auto"/>
-      </w:pPr>
       <w:r>
-        <w:t>Diagnosed and fixed production issues under time pressure, including a Hexagon query failure, cursor preservation on failed pulls to prevent data loss, and clearer logging of unclean agent shutdowns.</w:t>
+        <w:rPr>
+          <w:b/>
+        </w:rPr>
+        <w:t>6</w:t>
+      </w:r>
+      <w:r>
+        <w:t xml:space="preserve"> data-source types – SQL Server, Oracle, Informix, ODBC, REST, and XML.</w:t>
       </w:r>
     </w:p>
     <w:p>
@@ -238,10 +222,19 @@
         <w:rPr>
           <w:b/>
         </w:rPr>
-        <w:t>50+ Linear-tracked issues across 170+ commits</w:t>
+        <w:t>50+</w:t>
       </w:r>
       <w:r>
-        <w:t xml:space="preserve"> through a reviewed pull-request workflow, covering backfill reliability, </w:t>
+        <w:t xml:space="preserve"> Linear-tracked issues across </w:t>
+      </w:r>
+      <w:r>
+        <w:rPr>
+          <w:b/>
+        </w:rPr>
+        <w:t>170+</w:t>
+      </w:r>
+      <w:r>
+        <w:t xml:space="preserve"> commits via a reviewed pull-request workflow, covering backfill reliability, </w:t>
       </w:r>
       <w:proofErr w:type="spellStart"/>
       <w:r>
@@ -249,16 +242,16 @@
       </w:r>
       <w:proofErr w:type="spellEnd"/>
       <w:r>
-        <w:t>-correctness fixes, and per-connector telemetry.</w:t>
+        <w:t>-correctness fixes, per-connector telemetry, and production fixes under pressure – including cursor preservation on failed pulls to prevent data loss.</w:t>
       </w:r>
     </w:p>
     <w:p>
       <w:pPr>
         <w:pStyle w:val="ListBullet"/>
-        <w:spacing w:after="80" w:line="240" w:lineRule="auto"/>
+        <w:spacing w:after="20" w:line="240" w:lineRule="auto"/>
       </w:pPr>
       <w:r>
-        <w:t xml:space="preserve">Built a full-stack connectivity and firewall-diagnostics tool with a React and TypeScript frontend and an ASP.NET Core API, instrumented with </w:t>
+        <w:t xml:space="preserve">Built a full-stack connectivity and firewall-diagnostics tool with a React/TypeScript frontend and an ASP.NET Core API, instrumented with </w:t>
       </w:r>
       <w:proofErr w:type="spellStart"/>
       <w:r>
@@ -267,6 +260,65 @@
       <w:proofErr w:type="spellEnd"/>
       <w:r>
         <w:t xml:space="preserve"> and Datadog metrics.</w:t>
+      </w:r>
+    </w:p>
+    <w:p>
+      <w:pPr>
+        <w:tabs>
+          <w:tab w:val="right" w:pos="10080"/>
+        </w:tabs>
+        <w:spacing w:after="20" w:line="240" w:lineRule="auto"/>
+      </w:pPr>
+      <w:r>
+        <w:rPr>
+          <w:b/>
+          <w:sz w:val="20"/>
+        </w:rPr>
+        <w:t>Firmware Engineering Intern | Exact Assembly</w:t>
+      </w:r>
+      <w:r>
+        <w:tab/>
+        <w:t>May 2023 – Aug 2023</w:t>
+      </w:r>
+    </w:p>
+    <w:p>
+      <w:pPr>
+        <w:pStyle w:val="ListBullet"/>
+        <w:spacing w:after="20" w:line="240" w:lineRule="auto"/>
+      </w:pPr>
+      <w:r>
+        <w:t xml:space="preserve">Developed and debugged </w:t>
+      </w:r>
+      <w:r>
+        <w:rPr>
+          <w:b/>
+          <w:bCs/>
+        </w:rPr>
+        <w:t>1000+</w:t>
+      </w:r>
+      <w:r>
+        <w:t xml:space="preserve"> lines of </w:t>
+      </w:r>
+      <w:r>
+        <w:t>embedded firmware for control systems at a tech contracting startup.</w:t>
+      </w:r>
+    </w:p>
+    <w:p>
+      <w:pPr>
+        <w:pStyle w:val="ListBullet"/>
+        <w:spacing w:after="20" w:line="240" w:lineRule="auto"/>
+      </w:pPr>
+      <w:r>
+        <w:t>Implemented and tuned PID control loops to achieve stable, responsive closed-loop behavior on real hardware.</w:t>
+      </w:r>
+    </w:p>
+    <w:p>
+      <w:pPr>
+        <w:pStyle w:val="ListBullet"/>
+        <w:spacing w:after="20" w:line="240" w:lineRule="auto"/>
+      </w:pPr>
+      <w:r>
+        <w:t>Collaborated with the engineering team to integrate, test, and validate firmware against system requirements.</w:t>
       </w:r>
     </w:p>
     <w:p>
@@ -300,7 +352,27 @@
         <w:t>for a</w:t>
       </w:r>
       <w:r>
-        <w:t xml:space="preserve"> team of 5, delivering fully functional competition robots within 6-week build cycles for 3 consecutive seasons, achieving </w:t>
+        <w:t xml:space="preserve"> team of 5, delivering fully functional competition robots within </w:t>
+      </w:r>
+      <w:r>
+        <w:rPr>
+          <w:b/>
+          <w:bCs/>
+        </w:rPr>
+        <w:t>6-week build cycles</w:t>
+      </w:r>
+      <w:r>
+        <w:t xml:space="preserve"> for </w:t>
+      </w:r>
+      <w:r>
+        <w:rPr>
+          <w:b/>
+          <w:bCs/>
+        </w:rPr>
+        <w:t>3 consecutive</w:t>
+      </w:r>
+      <w:r>
+        <w:t xml:space="preserve"> seasons, achieving </w:t>
       </w:r>
       <w:r>
         <w:rPr>
@@ -335,19 +407,47 @@
       </w:r>
       <w:proofErr w:type="spellEnd"/>
       <w:r>
-        <w:t>, achieving 9</w:t>
+        <w:t xml:space="preserve">, achieving </w:t>
       </w:r>
       <w:r>
+        <w:rPr>
+          <w:b/>
+          <w:bCs/>
+        </w:rPr>
+        <w:t>9</w:t>
+      </w:r>
+      <w:r>
+        <w:rPr>
+          <w:b/>
+          <w:bCs/>
+        </w:rPr>
         <w:t>5</w:t>
       </w:r>
       <w:r>
-        <w:t xml:space="preserve">%+ </w:t>
+        <w:rPr>
+          <w:b/>
+          <w:bCs/>
+        </w:rPr>
+        <w:t>%+</w:t>
+      </w:r>
+      <w:r>
+        <w:t xml:space="preserve"> </w:t>
       </w:r>
       <w:r>
         <w:t xml:space="preserve">complete </w:t>
       </w:r>
       <w:r>
-        <w:t>autonomous routine success rate across 6 regional competitions with zero forfeits.</w:t>
+        <w:t xml:space="preserve">autonomous routine success rate across </w:t>
+      </w:r>
+      <w:r>
+        <w:rPr>
+          <w:b/>
+          <w:bCs/>
+        </w:rPr>
+        <w:t>6 regional competitions with zero forfeits</w:t>
+      </w:r>
+      <w:r>
+        <w:t>.</w:t>
       </w:r>
     </w:p>
     <w:p>
@@ -368,6 +468,75 @@
       <w:pPr>
         <w:spacing w:after="20" w:line="240" w:lineRule="auto"/>
       </w:pPr>
+      <w:proofErr w:type="spellStart"/>
+      <w:r>
+        <w:rPr>
+          <w:b/>
+          <w:sz w:val="20"/>
+        </w:rPr>
+        <w:t>BlitzSort</w:t>
+      </w:r>
+      <w:proofErr w:type="spellEnd"/>
+      <w:r>
+        <w:t xml:space="preserve"> | C++17, Performance Optimization, CPU Cache, Algorithms</w:t>
+      </w:r>
+    </w:p>
+    <w:p>
+      <w:pPr>
+        <w:spacing w:after="60" w:line="240" w:lineRule="auto"/>
+      </w:pPr>
+      <w:r>
+        <w:t xml:space="preserve">Cache-conscious quicksort achieving </w:t>
+      </w:r>
+      <w:r>
+        <w:rPr>
+          <w:b/>
+        </w:rPr>
+        <w:t>128x</w:t>
+      </w:r>
+      <w:r>
+        <w:t xml:space="preserve"> speedup on worst-case (reverse-sorted) data via median-of-three pivot selection, a 16-element insertion-sort threshold, and tail-recursion optimization – while holding O(n log n) and matching std::sort byte-for-byte.</w:t>
+      </w:r>
+    </w:p>
+    <w:p>
+      <w:pPr>
+        <w:spacing w:after="20" w:line="240" w:lineRule="auto"/>
+      </w:pPr>
+      <w:r>
+        <w:rPr>
+          <w:b/>
+          <w:sz w:val="20"/>
+        </w:rPr>
+        <w:t>order-me-this</w:t>
+      </w:r>
+      <w:r>
+        <w:t xml:space="preserve"> | C++17, Data Structures, Performance Optimization, Systems Design</w:t>
+      </w:r>
+    </w:p>
+    <w:p>
+      <w:pPr>
+        <w:spacing w:after="60" w:line="240" w:lineRule="auto"/>
+      </w:pPr>
+      <w:r>
+        <w:t xml:space="preserve">A minimal C++17 limit order book benchmarking three matching-engine data structures (std::map, unordered_map, sorted deque); isolating the matching hot path revealed a </w:t>
+      </w:r>
+      <w:r>
+        <w:rPr>
+          <w:b/>
+        </w:rPr>
+        <w:t>3.7x</w:t>
+      </w:r>
+      <w:r>
+        <w:t xml:space="preserve"> latency win for sorted deque</w:t>
+      </w:r>
+      <w:r>
+        <w:t>.</w:t>
+      </w:r>
+    </w:p>
+    <w:p>
+      <w:pPr>
+        <w:spacing w:after="20" w:line="240" w:lineRule="auto"/>
+      </w:pPr>
       <w:r>
         <w:rPr>
           <w:b/>
@@ -376,7 +545,7 @@
         <w:t>Accelerated Image Processing</w:t>
       </w:r>
       <w:r>
-        <w:t xml:space="preserve"> | OpenCL, C++17, GPU Computing, Image Processing</w:t>
+        <w:t xml:space="preserve"> | OpenCL, C++17, GPU Computing, Parallel Programming</w:t>
       </w:r>
     </w:p>
     <w:p>
@@ -384,16 +553,16 @@
         <w:spacing w:after="60" w:line="240" w:lineRule="auto"/>
       </w:pPr>
       <w:r>
-        <w:t xml:space="preserve">GPU-accelerated image filter pipeline (grayscale, Gaussian blur, Sobel edge detection) in OpenCL, benchmarked against a scalar CPU baseline to achieve </w:t>
+        <w:t xml:space="preserve">GPU-accelerated image-filter pipeline (grayscale, Gaussian blur, Sobel edge detection) in OpenCL, benchmarked against a scalar CPU baseline to achieve </w:t>
       </w:r>
       <w:r>
         <w:rPr>
           <w:b/>
         </w:rPr>
-        <w:t>15–26x speedups</w:t>
+        <w:t>15–26x</w:t>
       </w:r>
       <w:r>
-        <w:t xml:space="preserve"> on compute-bound filters.</w:t>
+        <w:t xml:space="preserve"> speedups on compute-bound filters.</w:t>
       </w:r>
     </w:p>
     <w:p>
@@ -415,54 +584,11 @@
       <w:pPr>
         <w:spacing w:after="60" w:line="240" w:lineRule="auto"/>
       </w:pPr>
-      <w:r>
-        <w:t>Built from scratch a distributed mutual exclusion system implementing Lamport's 1978 logical clocks paper over unreliable message-passing networks. Designed layered C++17 architecture with thread-safe components (</w:t>
-      </w:r>
-      <w:proofErr w:type="gramStart"/>
-      <w:r>
-        <w:t>std::</w:t>
-      </w:r>
-      <w:proofErr w:type="gramEnd"/>
-      <w:r>
-        <w:t xml:space="preserve">mutex, </w:t>
-      </w:r>
-      <w:proofErr w:type="gramStart"/>
-      <w:r>
-        <w:t>std::</w:t>
-      </w:r>
       <w:proofErr w:type="spellStart"/>
-      <w:proofErr w:type="gramEnd"/>
-      <w:r>
-        <w:t>condition_variable</w:t>
-      </w:r>
       <w:proofErr w:type="spellEnd"/>
       <w:r>
-        <w:t>, RAII) and chaos injection to verify correctness despite network delays and message reordering. Demonstrates causal ordering recovery and deadlock-free operation without shared clock or central coordinator.</w:t>
-      </w:r>
-    </w:p>
-    <w:p>
-      <w:pPr>
-        <w:spacing w:after="20" w:line="240" w:lineRule="auto"/>
-      </w:pPr>
-      <w:proofErr w:type="spellStart"/>
-      <w:r>
-        <w:rPr>
-          <w:b/>
-          <w:sz w:val="20"/>
-        </w:rPr>
-        <w:t>Spotigang</w:t>
-      </w:r>
-      <w:proofErr w:type="spellEnd"/>
-      <w:r>
-        <w:t xml:space="preserve"> | Node.js, Express, React, PostgreSQL, Spotify API</w:t>
-      </w:r>
-    </w:p>
-    <w:p>
-      <w:pPr>
-        <w:spacing w:after="60" w:line="240" w:lineRule="auto"/>
-      </w:pPr>
-      <w:r>
-        <w:t>Full-stack music social feed with secure authentication, real-time Spotify API integration, and friend-sharing workflows. Deployed live on Render.</w:t>
+        <w:rPr/>
+        <w:t>From-scratch distributed mutual-exclusion system implementing Lamport logical clocks over an unreliable message-passing network, using chaos injection to prove deadlock-free, causally-ordered operation without a shared clock.</w:t>
       </w:r>
     </w:p>
     <w:p>
@@ -491,7 +617,10 @@
         <w:t>University of Colorado Boulder</w:t>
       </w:r>
       <w:r>
-        <w:t xml:space="preserve"> | B.S. Computer Science (Expected May 2028)</w:t>
+        <w:t xml:space="preserve"> | B.S. Computer Science </w:t>
+      </w:r>
+      <w:r>
+        <w:t xml:space="preserve">                                                                         Sept 2024 – May 2028</w:t>
       </w:r>
     </w:p>
     <w:p>
@@ -526,12 +655,12 @@
       <w:r>
         <w:rPr>
           <w:b/>
-          <w:sz w:val="20"/>
         </w:rPr>
         <w:t xml:space="preserve">Languages: </w:t>
       </w:r>
       <w:r>
-        <w:t>C++, Python, Java, JavaScript, TypeScript, SQL, Bash, C</w:t>
+        <w:rPr/>
+        <w:t>C, C++17, C#, Python, Bash, SQL, Java, JavaScript/TypeScript</w:t>
       </w:r>
     </w:p>
     <w:p>
@@ -541,28 +670,12 @@
       <w:r>
         <w:rPr>
           <w:b/>
-          <w:sz w:val="20"/>
         </w:rPr>
-        <w:t xml:space="preserve">Frameworks &amp; Tools: </w:t>
+        <w:t xml:space="preserve">Systems &amp; Performance: </w:t>
       </w:r>
       <w:r>
-        <w:t xml:space="preserve">React, Node.js, Express, .NET, ASP.NET Core, </w:t>
-      </w:r>
-      <w:proofErr w:type="spellStart"/>
-      <w:r>
-        <w:t>WPILib</w:t>
-      </w:r>
-      <w:proofErr w:type="spellEnd"/>
-      <w:r>
-        <w:t xml:space="preserve">, Entity Framework Core, Docker, Git, PostgreSQL, SQL Server, </w:t>
-      </w:r>
-      <w:proofErr w:type="spellStart"/>
-      <w:r>
-        <w:t>OpenTelemetry</w:t>
-      </w:r>
-      <w:proofErr w:type="spellEnd"/>
-      <w:r>
-        <w:t>, Datadog, OpenCL</w:t>
+        <w:rPr/>
+        <w:t>Embedded Firmware, Control Systems &amp; PID, Concurrency &amp; Parallel Programming, Distributed Systems, Performance Optimization, CPU Cache &amp; Memory Hierarchy, GPU Computing (OpenCL)</w:t>
       </w:r>
     </w:p>
     <w:p>
@@ -572,17 +685,22 @@
       <w:r>
         <w:rPr>
           <w:b/>
-          <w:sz w:val="20"/>
         </w:rPr>
-        <w:t xml:space="preserve">Core Competencies: </w:t>
+        <w:t xml:space="preserve">Software &amp; Tools: </w:t>
       </w:r>
       <w:r>
-        <w:t>Full-Stack Development, System Integration, Data Pipelines, Real-Time Systems, Distributed Algorithms, Agile Development, GPU Computing, Parallel Programming</w:t>
+        <w:rPr/>
+        <w:t>Data Structures &amp; Algorithms, REST APIs, .NET / ASP.NET Core, Git, GDB, Linux/Unix</w:t>
       </w:r>
+    </w:p>
+    <w:p>
+      <w:pPr>
+        <w:spacing w:after="0" w:line="40" w:lineRule="exact" w:before="0"/>
+      </w:pPr>
     </w:p>
     <w:sectPr>
       <w:pgSz w:w="12240" w:h="15840"/>
-      <w:pgMar w:top="720" w:right="1080" w:bottom="720" w:left="1080" w:header="720" w:footer="720" w:gutter="0"/>
+      <w:pgMar w:top="720" w:right="720" w:bottom="720" w:left="720" w:header="720" w:footer="720" w:gutter="0"/>
       <w:cols w:space="720"/>
       <w:docGrid w:linePitch="360"/>
     </w:sectPr>

</xml_diff>